<commit_message>
Add risk matrix PDF; update docs and deps
Adds 'Documentos/Entrega 2/Cibersegurança e Defesa Cibernética/Matriz de Análise de Riscos.pdf'. Removes an obsolete ignore.txt in the same folder. Updates the binary report 'Relatório de Apresentação e Demonstração.docx' (content changed). Unpins dependencies in 'Documentos/Entrega 2/Ciência de Dados e Big Data/requirements.txt' by removing exact version specifiers for streamlit, pandas, and plotly to allow installing the latest compatible versions.
</commit_message>
<xml_diff>
--- a/Documentos/Entrega 2/Ciência de Dados e Big Data/Relatório de Apresentação e Demonstração.docx
+++ b/Documentos/Entrega 2/Ciência de Dados e Big Data/Relatório de Apresentação e Demonstração.docx
@@ -1,9 +1,18 @@
 
 <file path=word/document.xml><?xml version="1.0" encoding="utf-8"?>
-<w:document xmlns:wpc="http://schemas.microsoft.com/office/word/2010/wordprocessingCanvas" xmlns:cx="http://schemas.microsoft.com/office/drawing/2014/chartex" xmlns:cx1="http://schemas.microsoft.com/office/drawing/2015/9/8/chartex" xmlns:cx2="http://schemas.microsoft.com/office/drawing/2015/10/21/chartex" xmlns:cx3="http://schemas.microsoft.com/office/drawing/2016/5/9/chartex" xmlns:cx4="http://schemas.microsoft.com/office/drawing/2016/5/10/chartex" xmlns:cx5="http://schemas.microsoft.com/office/drawing/2016/5/11/chartex" xmlns:cx6="http://schemas.microsoft.com/office/drawing/2016/5/12/chartex" xmlns:cx7="http://schemas.microsoft.com/office/drawing/2016/5/13/chartex" xmlns:cx8="http://schemas.microsoft.com/office/drawing/2016/5/14/chartex" xmlns:mc="http://schemas.openxmlformats.org/markup-compatibility/2006" xmlns:aink="http://schemas.microsoft.com/office/drawing/2016/ink" xmlns:am3d="http://schemas.microsoft.com/office/drawing/2017/model3d" xmlns:o="urn:schemas-microsoft-com:office:office" xmlns:oel="http://schemas.microsoft.com/office/2019/extlst" xmlns:r="http://schemas.openxmlformats.org/officeDocument/2006/relationships" xmlns:m="http://schemas.openxmlformats.org/officeDocument/2006/math" xmlns:v="urn:schemas-microsoft-com:vml" xmlns:wp14="http://schemas.microsoft.com/office/word/2010/wordprocessingDrawing" xmlns:wp="http://schemas.openxmlformats.org/drawingml/2006/wordprocessingDrawing" xmlns:w10="urn:schemas-microsoft-com:office:word" xmlns:w="http://schemas.openxmlformats.org/wordprocessingml/2006/main" xmlns:w14="http://schemas.microsoft.com/office/word/2010/wordml" xmlns:w15="http://schemas.microsoft.com/office/word/2012/wordml" xmlns:w16cex="http://schemas.microsoft.com/office/word/2018/wordml/cex" xmlns:w16cid="http://schemas.microsoft.com/office/word/2016/wordml/cid" xmlns:w16="http://schemas.microsoft.com/office/word/2018/wordml" xmlns:w16sdtdh="http://schemas.microsoft.com/office/word/2020/wordml/sdtdatahash" xmlns:w16se="http://schemas.microsoft.com/office/word/2015/wordml/symex" xmlns:wpg="http://schemas.microsoft.com/office/word/2010/wordprocessingGroup" xmlns:wpi="http://schemas.microsoft.com/office/word/2010/wordprocessingInk" xmlns:wne="http://schemas.microsoft.com/office/word/2006/wordml" xmlns:wps="http://schemas.microsoft.com/office/word/2010/wordprocessingShape" mc:Ignorable="w14 w15 w16se w16cid w16 w16cex w16sdtdh wp14">
+<w:document xmlns:wpc="http://schemas.microsoft.com/office/word/2010/wordprocessingCanvas" xmlns:cx="http://schemas.microsoft.com/office/drawing/2014/chartex" xmlns:cx1="http://schemas.microsoft.com/office/drawing/2015/9/8/chartex" xmlns:cx2="http://schemas.microsoft.com/office/drawing/2015/10/21/chartex" xmlns:cx3="http://schemas.microsoft.com/office/drawing/2016/5/9/chartex" xmlns:cx4="http://schemas.microsoft.com/office/drawing/2016/5/10/chartex" xmlns:cx5="http://schemas.microsoft.com/office/drawing/2016/5/11/chartex" xmlns:cx6="http://schemas.microsoft.com/office/drawing/2016/5/12/chartex" xmlns:cx7="http://schemas.microsoft.com/office/drawing/2016/5/13/chartex" xmlns:cx8="http://schemas.microsoft.com/office/drawing/2016/5/14/chartex" xmlns:mc="http://schemas.openxmlformats.org/markup-compatibility/2006" xmlns:aink="http://schemas.microsoft.com/office/drawing/2016/ink" xmlns:am3d="http://schemas.microsoft.com/office/drawing/2017/model3d" xmlns:o="urn:schemas-microsoft-com:office:office" xmlns:oel="http://schemas.microsoft.com/office/2019/extlst" xmlns:r="http://schemas.openxmlformats.org/officeDocument/2006/relationships" xmlns:m="http://schemas.openxmlformats.org/officeDocument/2006/math" xmlns:v="urn:schemas-microsoft-com:vml" xmlns:wp14="http://schemas.microsoft.com/office/word/2010/wordprocessingDrawing" xmlns:wp="http://schemas.openxmlformats.org/drawingml/2006/wordprocessingDrawing" xmlns:w10="urn:schemas-microsoft-com:office:word" xmlns:w="http://schemas.openxmlformats.org/wordprocessingml/2006/main" xmlns:w14="http://schemas.microsoft.com/office/word/2010/wordml" xmlns:w15="http://schemas.microsoft.com/office/word/2012/wordml" xmlns:w16cex="http://schemas.microsoft.com/office/word/2018/wordml/cex" xmlns:w16cid="http://schemas.microsoft.com/office/word/2016/wordml/cid" xmlns:w16="http://schemas.microsoft.com/office/word/2018/wordml" xmlns:w16du="http://schemas.microsoft.com/office/word/2023/wordml/word16du" xmlns:w16sdtdh="http://schemas.microsoft.com/office/word/2020/wordml/sdtdatahash" xmlns:w16sdtfl="http://schemas.microsoft.com/office/word/2024/wordml/sdtformatlock" xmlns:w16se="http://schemas.microsoft.com/office/word/2015/wordml/symex" xmlns:wpg="http://schemas.microsoft.com/office/word/2010/wordprocessingGroup" xmlns:wpi="http://schemas.microsoft.com/office/word/2010/wordprocessingInk" xmlns:wne="http://schemas.microsoft.com/office/word/2006/wordml" xmlns:wps="http://schemas.microsoft.com/office/word/2010/wordprocessingShape" mc:Ignorable="w14 w15 w16se w16cid w16 w16cex w16sdtdh w16sdtfl w16du wp14">
   <w:body>
     <w:sdt>
       <w:sdtPr>
+        <w:rPr>
+          <w:rFonts w:asciiTheme="minorHAnsi" w:eastAsiaTheme="minorHAnsi" w:hAnsiTheme="minorHAnsi" w:cstheme="minorBidi"/>
+          <w:color w:val="auto"/>
+          <w:kern w:val="2"/>
+          <w:sz w:val="24"/>
+          <w:szCs w:val="24"/>
+          <w:lang w:eastAsia="en-US"/>
+          <w14:ligatures w14:val="standardContextual"/>
+        </w:rPr>
         <w:id w:val="-168329419"/>
         <w:docPartObj>
           <w:docPartGallery w:val="Table of Contents"/>
@@ -12,15 +21,8 @@
       </w:sdtPr>
       <w:sdtEndPr>
         <w:rPr>
-          <w:rFonts w:asciiTheme="minorHAnsi" w:eastAsiaTheme="minorHAnsi" w:hAnsiTheme="minorHAnsi" w:cstheme="minorBidi"/>
           <w:b/>
           <w:bCs/>
-          <w:color w:val="auto"/>
-          <w:kern w:val="2"/>
-          <w:sz w:val="24"/>
-          <w:szCs w:val="24"/>
-          <w:lang w:eastAsia="en-US"/>
-          <w14:ligatures w14:val="standardContextual"/>
         </w:rPr>
       </w:sdtEndPr>
       <w:sdtContent>
@@ -889,10 +891,24 @@
     </w:p>
     <w:p>
       <w:pPr>
+        <w:rPr>
+          <w:rFonts w:asciiTheme="majorHAnsi" w:eastAsiaTheme="majorEastAsia" w:hAnsiTheme="majorHAnsi" w:cstheme="majorBidi"/>
+          <w:color w:val="0F4761" w:themeColor="accent1" w:themeShade="BF"/>
+          <w:sz w:val="32"/>
+          <w:szCs w:val="32"/>
+        </w:rPr>
+      </w:pPr>
+      <w:bookmarkStart w:id="3" w:name="_Toc229085010"/>
+      <w:r>
+        <w:br w:type="page"/>
+      </w:r>
+    </w:p>
+    <w:p>
+      <w:pPr>
         <w:pStyle w:val="Ttulo2"/>
       </w:pPr>
-      <w:bookmarkStart w:id="3" w:name="_Toc229085010"/>
-      <w:r>
+      <w:r>
+        <w:lastRenderedPageBreak/>
         <w:t>3. Análise de Impacto Econômico</w:t>
       </w:r>
       <w:bookmarkEnd w:id="3"/>
@@ -1047,29 +1063,58 @@
           <w:b/>
           <w:bCs/>
         </w:rPr>
+        <w:t>Resultado Econ</w:t>
+      </w:r>
+      <w:r>
+        <w:rPr>
+          <w:rFonts w:ascii="Arial" w:hAnsi="Arial" w:cs="Arial"/>
+          <w:b/>
+          <w:bCs/>
+        </w:rPr>
+        <w:t>ô</w:t>
+      </w:r>
+      <w:r>
+        <w:rPr>
+          <w:rFonts w:ascii="Arial" w:hAnsi="Arial" w:cs="Arial"/>
+          <w:b/>
+          <w:bCs/>
+        </w:rPr>
+        <w:t>mico:</w:t>
+      </w:r>
+      <w:r>
+        <w:rPr>
+          <w:rFonts w:ascii="Arial" w:hAnsi="Arial" w:cs="Arial"/>
+        </w:rPr>
+        <w:t xml:space="preserve"> Este cenário permite injetar dólares na economia local e aumentar drasticamente o poder de compra do talento brasileiro, mantendo custos competitivos para as empresas estrangeiras.</w:t>
+      </w:r>
+    </w:p>
+    <w:p>
+      <w:pPr>
+        <w:rPr>
+          <w:rFonts w:ascii="Arial" w:hAnsi="Arial" w:cs="Arial"/>
+        </w:rPr>
+      </w:pPr>
+    </w:p>
+    <w:p>
+      <w:pPr>
+        <w:rPr>
+          <w:rFonts w:asciiTheme="majorHAnsi" w:eastAsiaTheme="majorEastAsia" w:hAnsiTheme="majorHAnsi" w:cstheme="majorBidi"/>
+          <w:color w:val="0F4761" w:themeColor="accent1" w:themeShade="BF"/>
+          <w:sz w:val="32"/>
+          <w:szCs w:val="32"/>
+        </w:rPr>
+      </w:pPr>
+      <w:bookmarkStart w:id="4" w:name="_Toc229085011"/>
+      <w:r>
+        <w:br w:type="page"/>
+      </w:r>
+    </w:p>
+    <w:p>
+      <w:pPr>
+        <w:pStyle w:val="Ttulo2"/>
+      </w:pPr>
+      <w:r>
         <w:lastRenderedPageBreak/>
-        <w:t>Resultado Económico:</w:t>
-      </w:r>
-      <w:r>
-        <w:rPr>
-          <w:rFonts w:ascii="Arial" w:hAnsi="Arial" w:cs="Arial"/>
-        </w:rPr>
-        <w:t xml:space="preserve"> Este cenário permite injetar dólares na economia local e aumentar drasticamente o poder de compra do talento brasileiro, mantendo custos competitivos para as empresas estrangeiras.</w:t>
-      </w:r>
-    </w:p>
-    <w:p>
-      <w:pPr>
-        <w:rPr>
-          <w:rFonts w:ascii="Arial" w:hAnsi="Arial" w:cs="Arial"/>
-        </w:rPr>
-      </w:pPr>
-    </w:p>
-    <w:p>
-      <w:pPr>
-        <w:pStyle w:val="Ttulo2"/>
-      </w:pPr>
-      <w:bookmarkStart w:id="4" w:name="_Toc229085011"/>
-      <w:r>
         <w:t>4. Análise de Impacto Social e Mapeamento de Talentos</w:t>
       </w:r>
       <w:bookmarkEnd w:id="4"/>
@@ -1405,7 +1450,7 @@
 </file>
 
 <file path=word/endnotes.xml><?xml version="1.0" encoding="utf-8"?>
-<w:endnotes xmlns:wpc="http://schemas.microsoft.com/office/word/2010/wordprocessingCanvas" xmlns:cx="http://schemas.microsoft.com/office/drawing/2014/chartex" xmlns:cx1="http://schemas.microsoft.com/office/drawing/2015/9/8/chartex" xmlns:cx2="http://schemas.microsoft.com/office/drawing/2015/10/21/chartex" xmlns:cx3="http://schemas.microsoft.com/office/drawing/2016/5/9/chartex" xmlns:cx4="http://schemas.microsoft.com/office/drawing/2016/5/10/chartex" xmlns:cx5="http://schemas.microsoft.com/office/drawing/2016/5/11/chartex" xmlns:cx6="http://schemas.microsoft.com/office/drawing/2016/5/12/chartex" xmlns:cx7="http://schemas.microsoft.com/office/drawing/2016/5/13/chartex" xmlns:cx8="http://schemas.microsoft.com/office/drawing/2016/5/14/chartex" xmlns:mc="http://schemas.openxmlformats.org/markup-compatibility/2006" xmlns:aink="http://schemas.microsoft.com/office/drawing/2016/ink" xmlns:am3d="http://schemas.microsoft.com/office/drawing/2017/model3d" xmlns:o="urn:schemas-microsoft-com:office:office" xmlns:oel="http://schemas.microsoft.com/office/2019/extlst" xmlns:r="http://schemas.openxmlformats.org/officeDocument/2006/relationships" xmlns:m="http://schemas.openxmlformats.org/officeDocument/2006/math" xmlns:v="urn:schemas-microsoft-com:vml" xmlns:wp14="http://schemas.microsoft.com/office/word/2010/wordprocessingDrawing" xmlns:wp="http://schemas.openxmlformats.org/drawingml/2006/wordprocessingDrawing" xmlns:w10="urn:schemas-microsoft-com:office:word" xmlns:w="http://schemas.openxmlformats.org/wordprocessingml/2006/main" xmlns:w14="http://schemas.microsoft.com/office/word/2010/wordml" xmlns:w15="http://schemas.microsoft.com/office/word/2012/wordml" xmlns:w16cex="http://schemas.microsoft.com/office/word/2018/wordml/cex" xmlns:w16cid="http://schemas.microsoft.com/office/word/2016/wordml/cid" xmlns:w16="http://schemas.microsoft.com/office/word/2018/wordml" xmlns:w16sdtdh="http://schemas.microsoft.com/office/word/2020/wordml/sdtdatahash" xmlns:w16se="http://schemas.microsoft.com/office/word/2015/wordml/symex" xmlns:wpg="http://schemas.microsoft.com/office/word/2010/wordprocessingGroup" xmlns:wpi="http://schemas.microsoft.com/office/word/2010/wordprocessingInk" xmlns:wne="http://schemas.microsoft.com/office/word/2006/wordml" xmlns:wps="http://schemas.microsoft.com/office/word/2010/wordprocessingShape" mc:Ignorable="w14 w15 w16se w16cid w16 w16cex w16sdtdh wp14">
+<w:endnotes xmlns:wpc="http://schemas.microsoft.com/office/word/2010/wordprocessingCanvas" xmlns:cx="http://schemas.microsoft.com/office/drawing/2014/chartex" xmlns:cx1="http://schemas.microsoft.com/office/drawing/2015/9/8/chartex" xmlns:cx2="http://schemas.microsoft.com/office/drawing/2015/10/21/chartex" xmlns:cx3="http://schemas.microsoft.com/office/drawing/2016/5/9/chartex" xmlns:cx4="http://schemas.microsoft.com/office/drawing/2016/5/10/chartex" xmlns:cx5="http://schemas.microsoft.com/office/drawing/2016/5/11/chartex" xmlns:cx6="http://schemas.microsoft.com/office/drawing/2016/5/12/chartex" xmlns:cx7="http://schemas.microsoft.com/office/drawing/2016/5/13/chartex" xmlns:cx8="http://schemas.microsoft.com/office/drawing/2016/5/14/chartex" xmlns:mc="http://schemas.openxmlformats.org/markup-compatibility/2006" xmlns:aink="http://schemas.microsoft.com/office/drawing/2016/ink" xmlns:am3d="http://schemas.microsoft.com/office/drawing/2017/model3d" xmlns:o="urn:schemas-microsoft-com:office:office" xmlns:oel="http://schemas.microsoft.com/office/2019/extlst" xmlns:r="http://schemas.openxmlformats.org/officeDocument/2006/relationships" xmlns:m="http://schemas.openxmlformats.org/officeDocument/2006/math" xmlns:v="urn:schemas-microsoft-com:vml" xmlns:wp14="http://schemas.microsoft.com/office/word/2010/wordprocessingDrawing" xmlns:wp="http://schemas.openxmlformats.org/drawingml/2006/wordprocessingDrawing" xmlns:w10="urn:schemas-microsoft-com:office:word" xmlns:w="http://schemas.openxmlformats.org/wordprocessingml/2006/main" xmlns:w14="http://schemas.microsoft.com/office/word/2010/wordml" xmlns:w15="http://schemas.microsoft.com/office/word/2012/wordml" xmlns:w16cex="http://schemas.microsoft.com/office/word/2018/wordml/cex" xmlns:w16cid="http://schemas.microsoft.com/office/word/2016/wordml/cid" xmlns:w16="http://schemas.microsoft.com/office/word/2018/wordml" xmlns:w16du="http://schemas.microsoft.com/office/word/2023/wordml/word16du" xmlns:w16sdtdh="http://schemas.microsoft.com/office/word/2020/wordml/sdtdatahash" xmlns:w16sdtfl="http://schemas.microsoft.com/office/word/2024/wordml/sdtformatlock" xmlns:w16se="http://schemas.microsoft.com/office/word/2015/wordml/symex" xmlns:wpg="http://schemas.microsoft.com/office/word/2010/wordprocessingGroup" xmlns:wpi="http://schemas.microsoft.com/office/word/2010/wordprocessingInk" xmlns:wne="http://schemas.microsoft.com/office/word/2006/wordml" xmlns:wps="http://schemas.microsoft.com/office/word/2010/wordprocessingShape" mc:Ignorable="w14 w15 w16se w16cid w16 w16cex w16sdtdh w16sdtfl w16du wp14">
   <w:endnote w:type="separator" w:id="-1">
     <w:p>
       <w:pPr>
@@ -1430,7 +1475,7 @@
 </file>
 
 <file path=word/footnotes.xml><?xml version="1.0" encoding="utf-8"?>
-<w:footnotes xmlns:wpc="http://schemas.microsoft.com/office/word/2010/wordprocessingCanvas" xmlns:cx="http://schemas.microsoft.com/office/drawing/2014/chartex" xmlns:cx1="http://schemas.microsoft.com/office/drawing/2015/9/8/chartex" xmlns:cx2="http://schemas.microsoft.com/office/drawing/2015/10/21/chartex" xmlns:cx3="http://schemas.microsoft.com/office/drawing/2016/5/9/chartex" xmlns:cx4="http://schemas.microsoft.com/office/drawing/2016/5/10/chartex" xmlns:cx5="http://schemas.microsoft.com/office/drawing/2016/5/11/chartex" xmlns:cx6="http://schemas.microsoft.com/office/drawing/2016/5/12/chartex" xmlns:cx7="http://schemas.microsoft.com/office/drawing/2016/5/13/chartex" xmlns:cx8="http://schemas.microsoft.com/office/drawing/2016/5/14/chartex" xmlns:mc="http://schemas.openxmlformats.org/markup-compatibility/2006" xmlns:aink="http://schemas.microsoft.com/office/drawing/2016/ink" xmlns:am3d="http://schemas.microsoft.com/office/drawing/2017/model3d" xmlns:o="urn:schemas-microsoft-com:office:office" xmlns:oel="http://schemas.microsoft.com/office/2019/extlst" xmlns:r="http://schemas.openxmlformats.org/officeDocument/2006/relationships" xmlns:m="http://schemas.openxmlformats.org/officeDocument/2006/math" xmlns:v="urn:schemas-microsoft-com:vml" xmlns:wp14="http://schemas.microsoft.com/office/word/2010/wordprocessingDrawing" xmlns:wp="http://schemas.openxmlformats.org/drawingml/2006/wordprocessingDrawing" xmlns:w10="urn:schemas-microsoft-com:office:word" xmlns:w="http://schemas.openxmlformats.org/wordprocessingml/2006/main" xmlns:w14="http://schemas.microsoft.com/office/word/2010/wordml" xmlns:w15="http://schemas.microsoft.com/office/word/2012/wordml" xmlns:w16cex="http://schemas.microsoft.com/office/word/2018/wordml/cex" xmlns:w16cid="http://schemas.microsoft.com/office/word/2016/wordml/cid" xmlns:w16="http://schemas.microsoft.com/office/word/2018/wordml" xmlns:w16sdtdh="http://schemas.microsoft.com/office/word/2020/wordml/sdtdatahash" xmlns:w16se="http://schemas.microsoft.com/office/word/2015/wordml/symex" xmlns:wpg="http://schemas.microsoft.com/office/word/2010/wordprocessingGroup" xmlns:wpi="http://schemas.microsoft.com/office/word/2010/wordprocessingInk" xmlns:wne="http://schemas.microsoft.com/office/word/2006/wordml" xmlns:wps="http://schemas.microsoft.com/office/word/2010/wordprocessingShape" mc:Ignorable="w14 w15 w16se w16cid w16 w16cex w16sdtdh wp14">
+<w:footnotes xmlns:wpc="http://schemas.microsoft.com/office/word/2010/wordprocessingCanvas" xmlns:cx="http://schemas.microsoft.com/office/drawing/2014/chartex" xmlns:cx1="http://schemas.microsoft.com/office/drawing/2015/9/8/chartex" xmlns:cx2="http://schemas.microsoft.com/office/drawing/2015/10/21/chartex" xmlns:cx3="http://schemas.microsoft.com/office/drawing/2016/5/9/chartex" xmlns:cx4="http://schemas.microsoft.com/office/drawing/2016/5/10/chartex" xmlns:cx5="http://schemas.microsoft.com/office/drawing/2016/5/11/chartex" xmlns:cx6="http://schemas.microsoft.com/office/drawing/2016/5/12/chartex" xmlns:cx7="http://schemas.microsoft.com/office/drawing/2016/5/13/chartex" xmlns:cx8="http://schemas.microsoft.com/office/drawing/2016/5/14/chartex" xmlns:mc="http://schemas.openxmlformats.org/markup-compatibility/2006" xmlns:aink="http://schemas.microsoft.com/office/drawing/2016/ink" xmlns:am3d="http://schemas.microsoft.com/office/drawing/2017/model3d" xmlns:o="urn:schemas-microsoft-com:office:office" xmlns:oel="http://schemas.microsoft.com/office/2019/extlst" xmlns:r="http://schemas.openxmlformats.org/officeDocument/2006/relationships" xmlns:m="http://schemas.openxmlformats.org/officeDocument/2006/math" xmlns:v="urn:schemas-microsoft-com:vml" xmlns:wp14="http://schemas.microsoft.com/office/word/2010/wordprocessingDrawing" xmlns:wp="http://schemas.openxmlformats.org/drawingml/2006/wordprocessingDrawing" xmlns:w10="urn:schemas-microsoft-com:office:word" xmlns:w="http://schemas.openxmlformats.org/wordprocessingml/2006/main" xmlns:w14="http://schemas.microsoft.com/office/word/2010/wordml" xmlns:w15="http://schemas.microsoft.com/office/word/2012/wordml" xmlns:w16cex="http://schemas.microsoft.com/office/word/2018/wordml/cex" xmlns:w16cid="http://schemas.microsoft.com/office/word/2016/wordml/cid" xmlns:w16="http://schemas.microsoft.com/office/word/2018/wordml" xmlns:w16du="http://schemas.microsoft.com/office/word/2023/wordml/word16du" xmlns:w16sdtdh="http://schemas.microsoft.com/office/word/2020/wordml/sdtdatahash" xmlns:w16sdtfl="http://schemas.microsoft.com/office/word/2024/wordml/sdtformatlock" xmlns:w16se="http://schemas.microsoft.com/office/word/2015/wordml/symex" xmlns:wpg="http://schemas.microsoft.com/office/word/2010/wordprocessingGroup" xmlns:wpi="http://schemas.microsoft.com/office/word/2010/wordprocessingInk" xmlns:wne="http://schemas.microsoft.com/office/word/2006/wordml" xmlns:wps="http://schemas.microsoft.com/office/word/2010/wordprocessingShape" mc:Ignorable="w14 w15 w16se w16cid w16 w16cex w16sdtdh w16sdtfl w16du wp14">
   <w:footnote w:type="separator" w:id="-1">
     <w:p>
       <w:pPr>
@@ -1455,7 +1500,7 @@
 </file>
 
 <file path=word/header1.xml><?xml version="1.0" encoding="utf-8"?>
-<w:hdr xmlns:wpc="http://schemas.microsoft.com/office/word/2010/wordprocessingCanvas" xmlns:cx="http://schemas.microsoft.com/office/drawing/2014/chartex" xmlns:cx1="http://schemas.microsoft.com/office/drawing/2015/9/8/chartex" xmlns:cx2="http://schemas.microsoft.com/office/drawing/2015/10/21/chartex" xmlns:cx3="http://schemas.microsoft.com/office/drawing/2016/5/9/chartex" xmlns:cx4="http://schemas.microsoft.com/office/drawing/2016/5/10/chartex" xmlns:cx5="http://schemas.microsoft.com/office/drawing/2016/5/11/chartex" xmlns:cx6="http://schemas.microsoft.com/office/drawing/2016/5/12/chartex" xmlns:cx7="http://schemas.microsoft.com/office/drawing/2016/5/13/chartex" xmlns:cx8="http://schemas.microsoft.com/office/drawing/2016/5/14/chartex" xmlns:mc="http://schemas.openxmlformats.org/markup-compatibility/2006" xmlns:aink="http://schemas.microsoft.com/office/drawing/2016/ink" xmlns:am3d="http://schemas.microsoft.com/office/drawing/2017/model3d" xmlns:o="urn:schemas-microsoft-com:office:office" xmlns:oel="http://schemas.microsoft.com/office/2019/extlst" xmlns:r="http://schemas.openxmlformats.org/officeDocument/2006/relationships" xmlns:m="http://schemas.openxmlformats.org/officeDocument/2006/math" xmlns:v="urn:schemas-microsoft-com:vml" xmlns:wp14="http://schemas.microsoft.com/office/word/2010/wordprocessingDrawing" xmlns:wp="http://schemas.openxmlformats.org/drawingml/2006/wordprocessingDrawing" xmlns:w10="urn:schemas-microsoft-com:office:word" xmlns:w="http://schemas.openxmlformats.org/wordprocessingml/2006/main" xmlns:w14="http://schemas.microsoft.com/office/word/2010/wordml" xmlns:w15="http://schemas.microsoft.com/office/word/2012/wordml" xmlns:w16cex="http://schemas.microsoft.com/office/word/2018/wordml/cex" xmlns:w16cid="http://schemas.microsoft.com/office/word/2016/wordml/cid" xmlns:w16="http://schemas.microsoft.com/office/word/2018/wordml" xmlns:w16sdtdh="http://schemas.microsoft.com/office/word/2020/wordml/sdtdatahash" xmlns:w16se="http://schemas.microsoft.com/office/word/2015/wordml/symex" xmlns:wpg="http://schemas.microsoft.com/office/word/2010/wordprocessingGroup" xmlns:wpi="http://schemas.microsoft.com/office/word/2010/wordprocessingInk" xmlns:wne="http://schemas.microsoft.com/office/word/2006/wordml" xmlns:wps="http://schemas.microsoft.com/office/word/2010/wordprocessingShape" mc:Ignorable="w14 w15 w16se w16cid w16 w16cex w16sdtdh wp14">
+<w:hdr xmlns:wpc="http://schemas.microsoft.com/office/word/2010/wordprocessingCanvas" xmlns:cx="http://schemas.microsoft.com/office/drawing/2014/chartex" xmlns:cx1="http://schemas.microsoft.com/office/drawing/2015/9/8/chartex" xmlns:cx2="http://schemas.microsoft.com/office/drawing/2015/10/21/chartex" xmlns:cx3="http://schemas.microsoft.com/office/drawing/2016/5/9/chartex" xmlns:cx4="http://schemas.microsoft.com/office/drawing/2016/5/10/chartex" xmlns:cx5="http://schemas.microsoft.com/office/drawing/2016/5/11/chartex" xmlns:cx6="http://schemas.microsoft.com/office/drawing/2016/5/12/chartex" xmlns:cx7="http://schemas.microsoft.com/office/drawing/2016/5/13/chartex" xmlns:cx8="http://schemas.microsoft.com/office/drawing/2016/5/14/chartex" xmlns:mc="http://schemas.openxmlformats.org/markup-compatibility/2006" xmlns:aink="http://schemas.microsoft.com/office/drawing/2016/ink" xmlns:am3d="http://schemas.microsoft.com/office/drawing/2017/model3d" xmlns:o="urn:schemas-microsoft-com:office:office" xmlns:oel="http://schemas.microsoft.com/office/2019/extlst" xmlns:r="http://schemas.openxmlformats.org/officeDocument/2006/relationships" xmlns:m="http://schemas.openxmlformats.org/officeDocument/2006/math" xmlns:v="urn:schemas-microsoft-com:vml" xmlns:wp14="http://schemas.microsoft.com/office/word/2010/wordprocessingDrawing" xmlns:wp="http://schemas.openxmlformats.org/drawingml/2006/wordprocessingDrawing" xmlns:w10="urn:schemas-microsoft-com:office:word" xmlns:w="http://schemas.openxmlformats.org/wordprocessingml/2006/main" xmlns:w14="http://schemas.microsoft.com/office/word/2010/wordml" xmlns:w15="http://schemas.microsoft.com/office/word/2012/wordml" xmlns:w16cex="http://schemas.microsoft.com/office/word/2018/wordml/cex" xmlns:w16cid="http://schemas.microsoft.com/office/word/2016/wordml/cid" xmlns:w16="http://schemas.microsoft.com/office/word/2018/wordml" xmlns:w16du="http://schemas.microsoft.com/office/word/2023/wordml/word16du" xmlns:w16sdtdh="http://schemas.microsoft.com/office/word/2020/wordml/sdtdatahash" xmlns:w16sdtfl="http://schemas.microsoft.com/office/word/2024/wordml/sdtformatlock" xmlns:w16se="http://schemas.microsoft.com/office/word/2015/wordml/symex" xmlns:wpg="http://schemas.microsoft.com/office/word/2010/wordprocessingGroup" xmlns:wpi="http://schemas.microsoft.com/office/word/2010/wordprocessingInk" xmlns:wne="http://schemas.microsoft.com/office/word/2006/wordml" xmlns:wps="http://schemas.microsoft.com/office/word/2010/wordprocessingShape" mc:Ignorable="w14 w15 w16se w16cid w16 w16cex w16sdtdh w16sdtfl w16du wp14">
   <w:tbl>
     <w:tblPr>
       <w:tblW w:w="5000" w:type="pct"/>
@@ -1556,7 +1601,7 @@
 </file>
 
 <file path=word/numbering.xml><?xml version="1.0" encoding="utf-8"?>
-<w:numbering xmlns:wpc="http://schemas.microsoft.com/office/word/2010/wordprocessingCanvas" xmlns:cx="http://schemas.microsoft.com/office/drawing/2014/chartex" xmlns:cx1="http://schemas.microsoft.com/office/drawing/2015/9/8/chartex" xmlns:cx2="http://schemas.microsoft.com/office/drawing/2015/10/21/chartex" xmlns:cx3="http://schemas.microsoft.com/office/drawing/2016/5/9/chartex" xmlns:cx4="http://schemas.microsoft.com/office/drawing/2016/5/10/chartex" xmlns:cx5="http://schemas.microsoft.com/office/drawing/2016/5/11/chartex" xmlns:cx6="http://schemas.microsoft.com/office/drawing/2016/5/12/chartex" xmlns:cx7="http://schemas.microsoft.com/office/drawing/2016/5/13/chartex" xmlns:cx8="http://schemas.microsoft.com/office/drawing/2016/5/14/chartex" xmlns:mc="http://schemas.openxmlformats.org/markup-compatibility/2006" xmlns:aink="http://schemas.microsoft.com/office/drawing/2016/ink" xmlns:am3d="http://schemas.microsoft.com/office/drawing/2017/model3d" xmlns:o="urn:schemas-microsoft-com:office:office" xmlns:oel="http://schemas.microsoft.com/office/2019/extlst" xmlns:r="http://schemas.openxmlformats.org/officeDocument/2006/relationships" xmlns:m="http://schemas.openxmlformats.org/officeDocument/2006/math" xmlns:v="urn:schemas-microsoft-com:vml" xmlns:wp14="http://schemas.microsoft.com/office/word/2010/wordprocessingDrawing" xmlns:wp="http://schemas.openxmlformats.org/drawingml/2006/wordprocessingDrawing" xmlns:w10="urn:schemas-microsoft-com:office:word" xmlns:w="http://schemas.openxmlformats.org/wordprocessingml/2006/main" xmlns:w14="http://schemas.microsoft.com/office/word/2010/wordml" xmlns:w15="http://schemas.microsoft.com/office/word/2012/wordml" xmlns:w16cex="http://schemas.microsoft.com/office/word/2018/wordml/cex" xmlns:w16cid="http://schemas.microsoft.com/office/word/2016/wordml/cid" xmlns:w16="http://schemas.microsoft.com/office/word/2018/wordml" xmlns:w16sdtdh="http://schemas.microsoft.com/office/word/2020/wordml/sdtdatahash" xmlns:w16se="http://schemas.microsoft.com/office/word/2015/wordml/symex" xmlns:wpg="http://schemas.microsoft.com/office/word/2010/wordprocessingGroup" xmlns:wpi="http://schemas.microsoft.com/office/word/2010/wordprocessingInk" xmlns:wne="http://schemas.microsoft.com/office/word/2006/wordml" xmlns:wps="http://schemas.microsoft.com/office/word/2010/wordprocessingShape" mc:Ignorable="w14 w15 w16se w16cid w16 w16cex w16sdtdh wp14">
+<w:numbering xmlns:wpc="http://schemas.microsoft.com/office/word/2010/wordprocessingCanvas" xmlns:cx="http://schemas.microsoft.com/office/drawing/2014/chartex" xmlns:cx1="http://schemas.microsoft.com/office/drawing/2015/9/8/chartex" xmlns:cx2="http://schemas.microsoft.com/office/drawing/2015/10/21/chartex" xmlns:cx3="http://schemas.microsoft.com/office/drawing/2016/5/9/chartex" xmlns:cx4="http://schemas.microsoft.com/office/drawing/2016/5/10/chartex" xmlns:cx5="http://schemas.microsoft.com/office/drawing/2016/5/11/chartex" xmlns:cx6="http://schemas.microsoft.com/office/drawing/2016/5/12/chartex" xmlns:cx7="http://schemas.microsoft.com/office/drawing/2016/5/13/chartex" xmlns:cx8="http://schemas.microsoft.com/office/drawing/2016/5/14/chartex" xmlns:mc="http://schemas.openxmlformats.org/markup-compatibility/2006" xmlns:aink="http://schemas.microsoft.com/office/drawing/2016/ink" xmlns:am3d="http://schemas.microsoft.com/office/drawing/2017/model3d" xmlns:o="urn:schemas-microsoft-com:office:office" xmlns:oel="http://schemas.microsoft.com/office/2019/extlst" xmlns:r="http://schemas.openxmlformats.org/officeDocument/2006/relationships" xmlns:m="http://schemas.openxmlformats.org/officeDocument/2006/math" xmlns:v="urn:schemas-microsoft-com:vml" xmlns:wp14="http://schemas.microsoft.com/office/word/2010/wordprocessingDrawing" xmlns:wp="http://schemas.openxmlformats.org/drawingml/2006/wordprocessingDrawing" xmlns:w10="urn:schemas-microsoft-com:office:word" xmlns:w="http://schemas.openxmlformats.org/wordprocessingml/2006/main" xmlns:w14="http://schemas.microsoft.com/office/word/2010/wordml" xmlns:w15="http://schemas.microsoft.com/office/word/2012/wordml" xmlns:w16cex="http://schemas.microsoft.com/office/word/2018/wordml/cex" xmlns:w16cid="http://schemas.microsoft.com/office/word/2016/wordml/cid" xmlns:w16="http://schemas.microsoft.com/office/word/2018/wordml" xmlns:w16du="http://schemas.microsoft.com/office/word/2023/wordml/word16du" xmlns:w16sdtdh="http://schemas.microsoft.com/office/word/2020/wordml/sdtdatahash" xmlns:w16sdtfl="http://schemas.microsoft.com/office/word/2024/wordml/sdtformatlock" xmlns:w16se="http://schemas.microsoft.com/office/word/2015/wordml/symex" xmlns:wpg="http://schemas.microsoft.com/office/word/2010/wordprocessingGroup" xmlns:wpi="http://schemas.microsoft.com/office/word/2010/wordprocessingInk" xmlns:wne="http://schemas.microsoft.com/office/word/2006/wordml" xmlns:wps="http://schemas.microsoft.com/office/word/2010/wordprocessingShape" mc:Ignorable="w14 w15 w16se w16cid w16 w16cex w16sdtdh w16sdtfl w16du wp14">
   <w:abstractNum w:abstractNumId="0" w15:restartNumberingAfterBreak="0">
     <w:nsid w:val="1AC075D3"/>
     <w:multiLevelType w:val="multilevel"/>
@@ -2169,7 +2214,7 @@
 </file>
 
 <file path=word/styles.xml><?xml version="1.0" encoding="utf-8"?>
-<w:styles xmlns:mc="http://schemas.openxmlformats.org/markup-compatibility/2006" xmlns:r="http://schemas.openxmlformats.org/officeDocument/2006/relationships" xmlns:w="http://schemas.openxmlformats.org/wordprocessingml/2006/main" xmlns:w14="http://schemas.microsoft.com/office/word/2010/wordml" xmlns:w15="http://schemas.microsoft.com/office/word/2012/wordml" xmlns:w16cex="http://schemas.microsoft.com/office/word/2018/wordml/cex" xmlns:w16cid="http://schemas.microsoft.com/office/word/2016/wordml/cid" xmlns:w16="http://schemas.microsoft.com/office/word/2018/wordml" xmlns:w16sdtdh="http://schemas.microsoft.com/office/word/2020/wordml/sdtdatahash" xmlns:w16se="http://schemas.microsoft.com/office/word/2015/wordml/symex" mc:Ignorable="w14 w15 w16se w16cid w16 w16cex w16sdtdh">
+<w:styles xmlns:mc="http://schemas.openxmlformats.org/markup-compatibility/2006" xmlns:r="http://schemas.openxmlformats.org/officeDocument/2006/relationships" xmlns:w="http://schemas.openxmlformats.org/wordprocessingml/2006/main" xmlns:w14="http://schemas.microsoft.com/office/word/2010/wordml" xmlns:w15="http://schemas.microsoft.com/office/word/2012/wordml" xmlns:w16cex="http://schemas.microsoft.com/office/word/2018/wordml/cex" xmlns:w16cid="http://schemas.microsoft.com/office/word/2016/wordml/cid" xmlns:w16="http://schemas.microsoft.com/office/word/2018/wordml" xmlns:w16du="http://schemas.microsoft.com/office/word/2023/wordml/word16du" xmlns:w16sdtdh="http://schemas.microsoft.com/office/word/2020/wordml/sdtdatahash" xmlns:w16sdtfl="http://schemas.microsoft.com/office/word/2024/wordml/sdtformatlock" xmlns:w16se="http://schemas.microsoft.com/office/word/2015/wordml/symex" mc:Ignorable="w14 w15 w16se w16cid w16 w16cex w16sdtdh w16sdtfl w16du">
   <w:docDefaults>
     <w:rPrDefault>
       <w:rPr>
@@ -2770,6 +2815,7 @@
   <w:style w:type="character" w:default="1" w:styleId="Fontepargpadro">
     <w:name w:val="Default Paragraph Font"/>
     <w:uiPriority w:val="1"/>
+    <w:semiHidden/>
     <w:unhideWhenUsed/>
   </w:style>
   <w:style w:type="table" w:default="1" w:styleId="Tabelanormal">

</xml_diff>

<commit_message>
Update report DOCX and PDF
Replace the presentation/demonstration report files for Entrega 2 (Ciência de Dados e Big Data). Both the .docx and .pdf binaries were updated to a revised version with content/formatting changes.
</commit_message>
<xml_diff>
--- a/Documentos/Entrega 2/Ciência de Dados e Big Data/Relatório de Apresentação e Demonstração.docx
+++ b/Documentos/Entrega 2/Ciência de Dados e Big Data/Relatório de Apresentação e Demonstração.docx
@@ -914,6 +914,54 @@
       <w:bookmarkEnd w:id="3"/>
     </w:p>
     <w:p>
+      <w:r>
+        <w:rPr>
+          <w:noProof/>
+        </w:rPr>
+        <w:drawing>
+          <wp:inline distT="0" distB="0" distL="0" distR="0" wp14:anchorId="071E318A" wp14:editId="4796AD7E">
+            <wp:extent cx="5400040" cy="3037205"/>
+            <wp:effectExtent l="0" t="0" r="0" b="0"/>
+            <wp:docPr id="1295203333" name="Imagem 3"/>
+            <wp:cNvGraphicFramePr>
+              <a:graphicFrameLocks xmlns:a="http://schemas.openxmlformats.org/drawingml/2006/main" noChangeAspect="1"/>
+            </wp:cNvGraphicFramePr>
+            <a:graphic xmlns:a="http://schemas.openxmlformats.org/drawingml/2006/main">
+              <a:graphicData uri="http://schemas.openxmlformats.org/drawingml/2006/picture">
+                <pic:pic xmlns:pic="http://schemas.openxmlformats.org/drawingml/2006/picture">
+                  <pic:nvPicPr>
+                    <pic:cNvPr id="1295203333" name="Imagem 1295203333"/>
+                    <pic:cNvPicPr/>
+                  </pic:nvPicPr>
+                  <pic:blipFill>
+                    <a:blip r:embed="rId7" cstate="print">
+                      <a:extLst>
+                        <a:ext uri="{28A0092B-C50C-407E-A947-70E740481C1C}">
+                          <a14:useLocalDpi xmlns:a14="http://schemas.microsoft.com/office/drawing/2010/main" val="0"/>
+                        </a:ext>
+                      </a:extLst>
+                    </a:blip>
+                    <a:stretch>
+                      <a:fillRect/>
+                    </a:stretch>
+                  </pic:blipFill>
+                  <pic:spPr>
+                    <a:xfrm>
+                      <a:off x="0" y="0"/>
+                      <a:ext cx="5400040" cy="3037205"/>
+                    </a:xfrm>
+                    <a:prstGeom prst="rect">
+                      <a:avLst/>
+                    </a:prstGeom>
+                  </pic:spPr>
+                </pic:pic>
+              </a:graphicData>
+            </a:graphic>
+          </wp:inline>
+        </w:drawing>
+      </w:r>
+    </w:p>
+    <w:p>
       <w:pPr>
         <w:ind w:firstLine="360"/>
         <w:rPr>
@@ -1120,6 +1168,54 @@
       <w:bookmarkEnd w:id="4"/>
     </w:p>
     <w:p>
+      <w:r>
+        <w:rPr>
+          <w:noProof/>
+        </w:rPr>
+        <w:drawing>
+          <wp:inline distT="0" distB="0" distL="0" distR="0" wp14:anchorId="5A59D170" wp14:editId="6949999B">
+            <wp:extent cx="5400040" cy="3037205"/>
+            <wp:effectExtent l="0" t="0" r="0" b="0"/>
+            <wp:docPr id="1051717030" name="Imagem 4"/>
+            <wp:cNvGraphicFramePr>
+              <a:graphicFrameLocks xmlns:a="http://schemas.openxmlformats.org/drawingml/2006/main" noChangeAspect="1"/>
+            </wp:cNvGraphicFramePr>
+            <a:graphic xmlns:a="http://schemas.openxmlformats.org/drawingml/2006/main">
+              <a:graphicData uri="http://schemas.openxmlformats.org/drawingml/2006/picture">
+                <pic:pic xmlns:pic="http://schemas.openxmlformats.org/drawingml/2006/picture">
+                  <pic:nvPicPr>
+                    <pic:cNvPr id="1051717030" name="Imagem 1051717030"/>
+                    <pic:cNvPicPr/>
+                  </pic:nvPicPr>
+                  <pic:blipFill>
+                    <a:blip r:embed="rId8" cstate="print">
+                      <a:extLst>
+                        <a:ext uri="{28A0092B-C50C-407E-A947-70E740481C1C}">
+                          <a14:useLocalDpi xmlns:a14="http://schemas.microsoft.com/office/drawing/2010/main" val="0"/>
+                        </a:ext>
+                      </a:extLst>
+                    </a:blip>
+                    <a:stretch>
+                      <a:fillRect/>
+                    </a:stretch>
+                  </pic:blipFill>
+                  <pic:spPr>
+                    <a:xfrm>
+                      <a:off x="0" y="0"/>
+                      <a:ext cx="5400040" cy="3037205"/>
+                    </a:xfrm>
+                    <a:prstGeom prst="rect">
+                      <a:avLst/>
+                    </a:prstGeom>
+                  </pic:spPr>
+                </pic:pic>
+              </a:graphicData>
+            </a:graphic>
+          </wp:inline>
+        </w:drawing>
+      </w:r>
+    </w:p>
+    <w:p>
       <w:pPr>
         <w:ind w:firstLine="360"/>
         <w:rPr>
@@ -1273,10 +1369,24 @@
     </w:p>
     <w:p>
       <w:pPr>
+        <w:rPr>
+          <w:rFonts w:asciiTheme="majorHAnsi" w:eastAsiaTheme="majorEastAsia" w:hAnsiTheme="majorHAnsi" w:cstheme="majorBidi"/>
+          <w:color w:val="0F4761" w:themeColor="accent1" w:themeShade="BF"/>
+          <w:sz w:val="32"/>
+          <w:szCs w:val="32"/>
+        </w:rPr>
+      </w:pPr>
+      <w:bookmarkStart w:id="5" w:name="_Toc229085012"/>
+      <w:r>
+        <w:br w:type="page"/>
+      </w:r>
+    </w:p>
+    <w:p>
+      <w:pPr>
         <w:pStyle w:val="Ttulo2"/>
       </w:pPr>
-      <w:bookmarkStart w:id="5" w:name="_Toc229085012"/>
-      <w:r>
+      <w:r>
+        <w:lastRenderedPageBreak/>
         <w:t xml:space="preserve">5. Inovação do MVP: </w:t>
       </w:r>
       <w:proofErr w:type="spellStart"/>
@@ -1439,7 +1549,7 @@
       </w:r>
     </w:p>
     <w:sectPr>
-      <w:headerReference w:type="default" r:id="rId7"/>
+      <w:headerReference w:type="default" r:id="rId9"/>
       <w:pgSz w:w="11906" w:h="16838"/>
       <w:pgMar w:top="1417" w:right="1701" w:bottom="1417" w:left="1701" w:header="708" w:footer="708" w:gutter="0"/>
       <w:cols w:space="708"/>

</xml_diff>